<commit_message>
Update Session 03 report
</commit_message>
<xml_diff>
--- a/Session 03/Session03_BaoCao_Template.docx
+++ b/Session 03/Session03_BaoCao_Template.docx
@@ -1,6 +1,6 @@
 
 <file path=word/document.xml><?xml version="1.0" encoding="utf-8"?>
-<w:document xmlns:wpc="http://schemas.microsoft.com/office/word/2010/wordprocessingCanvas" xmlns:cx="http://schemas.microsoft.com/office/drawing/2014/chartex" xmlns:cx1="http://schemas.microsoft.com/office/drawing/2015/9/8/chartex" xmlns:cx2="http://schemas.microsoft.com/office/drawing/2015/10/21/chartex" xmlns:cx3="http://schemas.microsoft.com/office/drawing/2016/5/9/chartex" xmlns:cx4="http://schemas.microsoft.com/office/drawing/2016/5/10/chartex" xmlns:cx5="http://schemas.microsoft.com/office/drawing/2016/5/11/chartex" xmlns:cx6="http://schemas.microsoft.com/office/drawing/2016/5/12/chartex" xmlns:cx7="http://schemas.microsoft.com/office/drawing/2016/5/13/chartex" xmlns:cx8="http://schemas.microsoft.com/office/drawing/2016/5/14/chartex" xmlns:mc="http://schemas.openxmlformats.org/markup-compatibility/2006" xmlns:aink="http://schemas.microsoft.com/office/drawing/2016/ink" xmlns:am3d="http://schemas.microsoft.com/office/drawing/2017/model3d" xmlns:o="urn:schemas-microsoft-com:office:office" xmlns:oel="http://schemas.microsoft.com/office/2019/extlst" xmlns:r="http://schemas.openxmlformats.org/officeDocument/2006/relationships" xmlns:m="http://schemas.openxmlformats.org/officeDocument/2006/math" xmlns:v="urn:schemas-microsoft-com:vml" xmlns:wp14="http://schemas.microsoft.com/office/word/2010/wordprocessingDrawing" xmlns:wp="http://schemas.openxmlformats.org/drawingml/2006/wordprocessingDrawing" xmlns:w10="urn:schemas-microsoft-com:office:word" xmlns:w="http://schemas.openxmlformats.org/wordprocessingml/2006/main" xmlns:w14="http://schemas.microsoft.com/office/word/2010/wordml" xmlns:w15="http://schemas.microsoft.com/office/word/2012/wordml" xmlns:w16cex="http://schemas.microsoft.com/office/word/2018/wordml/cex" xmlns:w16cid="http://schemas.microsoft.com/office/word/2016/wordml/cid" xmlns:w16="http://schemas.microsoft.com/office/word/2018/wordml" xmlns:w16sdtdh="http://schemas.microsoft.com/office/word/2020/wordml/sdtdatahash" xmlns:w16se="http://schemas.microsoft.com/office/word/2015/wordml/symex" xmlns:wpg="http://schemas.microsoft.com/office/word/2010/wordprocessingGroup" xmlns:wpi="http://schemas.microsoft.com/office/word/2010/wordprocessingInk" xmlns:wne="http://schemas.microsoft.com/office/word/2006/wordml" xmlns:wps="http://schemas.microsoft.com/office/word/2010/wordprocessingShape" mc:Ignorable="w14 w15 w16se w16cid w16 w16cex w16sdtdh wp14">
+<w:document xmlns:wpc="http://schemas.microsoft.com/office/word/2010/wordprocessingCanvas" xmlns:mc="http://schemas.openxmlformats.org/markup-compatibility/2006" xmlns:o="urn:schemas-microsoft-com:office:office" xmlns:r="http://schemas.openxmlformats.org/officeDocument/2006/relationships" xmlns:m="http://schemas.openxmlformats.org/officeDocument/2006/math" xmlns:v="urn:schemas-microsoft-com:vml" xmlns:wp14="http://schemas.microsoft.com/office/word/2010/wordprocessingDrawing" xmlns:wp="http://schemas.openxmlformats.org/drawingml/2006/wordprocessingDrawing" xmlns:w10="urn:schemas-microsoft-com:office:word" xmlns:w="http://schemas.openxmlformats.org/wordprocessingml/2006/main" xmlns:w14="http://schemas.microsoft.com/office/word/2010/wordml" xmlns:w15="http://schemas.microsoft.com/office/word/2012/wordml" xmlns:w16se="http://schemas.microsoft.com/office/word/2015/wordml/symex" xmlns:w16cid="http://schemas.microsoft.com/office/word/2016/wordml/cid" xmlns:w16="http://schemas.microsoft.com/office/word/2018/wordml" xmlns:w16cex="http://schemas.microsoft.com/office/word/2018/wordml/cex" xmlns:w16sdtdh="http://schemas.microsoft.com/office/word/2020/wordml/sdtdatahash" xmlns:wne="http://schemas.microsoft.com/office/word/2006/wordml" xmlns:wpg="http://schemas.microsoft.com/office/word/2010/wordprocessingGroup" xmlns:wps="http://schemas.microsoft.com/office/word/2010/wordprocessingShape" mc:Ignorable="w14 w15 w16se w16cid w16 w16cex w16sdtdh wp14">
   <w:body>
     <w:p>
       <w:pPr>
@@ -13,9 +13,12 @@
       </w:pPr>
       <w:r>
         <w:rPr>
+          <w:rFonts w:ascii="Times New Roman" w:hAnsi="Times New Roman" w:eastAsia="Times New Roman" w:cs="Times New Roman"/>
           <w:b/>
           <w:bCs/>
           <w:color w:val="000000" w:themeColor="text1"/>
+          <w:sz w:val="32"/>
+          <w:szCs w:val="32"/>
         </w:rPr>
         <w:t>BÁO CÁO NỘP BÀI - SESSION 03</w:t>
       </w:r>
@@ -30,6 +33,7 @@
       </w:pPr>
       <w:r>
         <w:rPr>
+          <w:rFonts w:ascii="Times New Roman" w:hAnsi="Times New Roman" w:eastAsia="Times New Roman" w:cs="Times New Roman"/>
           <w:i/>
           <w:iCs/>
           <w:color w:val="000000" w:themeColor="text1"/>
@@ -51,9 +55,12 @@
       </w:pPr>
       <w:r>
         <w:rPr>
+          <w:rFonts w:ascii="Times New Roman" w:hAnsi="Times New Roman" w:eastAsia="Times New Roman" w:cs="Times New Roman"/>
           <w:b/>
           <w:bCs/>
           <w:color w:val="000000" w:themeColor="text1"/>
+          <w:sz w:val="26"/>
+          <w:szCs w:val="26"/>
         </w:rPr>
         <w:t>1. Thông tin sinh viên</w:t>
       </w:r>
@@ -73,27 +80,20 @@
           <w:left w:w="10" w:type="dxa"/>
           <w:right w:w="10" w:type="dxa"/>
         </w:tblCellMar>
-        <w:tblLook w:val="0000" w:firstRow="0" w:lastRow="0" w:firstColumn="0" w:lastColumn="0" w:noHBand="0" w:noVBand="0"/>
       </w:tblPr>
       <w:tblGrid>
         <w:gridCol w:w="3000"/>
         <w:gridCol w:w="6350"/>
       </w:tblGrid>
       <w:tr>
-        <w:tblPrEx>
-          <w:tblCellMar>
-            <w:top w:w="0" w:type="dxa"/>
-            <w:bottom w:w="0" w:type="dxa"/>
-          </w:tblCellMar>
-        </w:tblPrEx>
         <w:tc>
           <w:tcPr>
             <w:tcW w:w="3000" w:type="dxa"/>
             <w:tcBorders>
-              <w:top w:val="none" w:sz="0" w:space="0" w:color="FFFFFF"/>
-              <w:left w:val="none" w:sz="0" w:space="0" w:color="FFFFFF"/>
-              <w:bottom w:val="none" w:sz="0" w:space="0" w:color="FFFFFF"/>
-              <w:right w:val="none" w:sz="0" w:space="0" w:color="FFFFFF"/>
+              <w:top w:val="none"/>
+              <w:left w:val="none"/>
+              <w:bottom w:val="none"/>
+              <w:right w:val="none"/>
             </w:tcBorders>
             <w:tcMar>
               <w:top w:w="100" w:type="dxa"/>
@@ -111,6 +111,7 @@
             </w:pPr>
             <w:r>
               <w:rPr>
+                <w:rFonts w:ascii="Times New Roman" w:hAnsi="Times New Roman" w:eastAsia="Times New Roman" w:cs="Times New Roman"/>
                 <w:color w:val="000000" w:themeColor="text1"/>
                 <w:sz w:val="22"/>
                 <w:szCs w:val="22"/>
@@ -120,13 +121,30 @@
           </w:p>
         </w:tc>
         <w:tc>
+          <w:p>
+            <w:r>
+              <w:rPr>
+                <w:rFonts w:ascii="Times New Roman" w:cs="Times New Roman"/>
+                <w:sz w:val="22"/>
+                <w:szCs w:val="22"/>
+              </w:rPr>
+              <w:t>Nguyễn Vương Quốc Tuấn</w:t>
+            </w:r>
+          </w:p>
+        </w:tc>
+      </w:tr>
+      <w:tr>
+        <w:trPr>
+          <w:trHeight w:val="555" w:hRule="atLeast"/>
+        </w:trPr>
+        <w:tc>
           <w:tcPr>
-            <w:tcW w:w="6350" w:type="dxa"/>
+            <w:tcW w:w="3000" w:type="dxa"/>
             <w:tcBorders>
-              <w:top w:val="none" w:sz="0" w:space="0" w:color="FFFFFF"/>
-              <w:left w:val="none" w:sz="0" w:space="0" w:color="FFFFFF"/>
-              <w:bottom w:val="none" w:sz="0" w:space="0" w:color="FFFFFF"/>
-              <w:right w:val="none" w:sz="0" w:space="0" w:color="FFFFFF"/>
+              <w:top w:val="none"/>
+              <w:left w:val="none"/>
+              <w:bottom w:val="none"/>
+              <w:right w:val="none"/>
             </w:tcBorders>
             <w:tcMar>
               <w:top w:w="100" w:type="dxa"/>
@@ -144,30 +162,48 @@
             </w:pPr>
             <w:r>
               <w:rPr>
+                <w:rFonts w:ascii="Times New Roman" w:hAnsi="Times New Roman" w:eastAsia="Times New Roman" w:cs="Times New Roman"/>
                 <w:color w:val="000000" w:themeColor="text1"/>
                 <w:sz w:val="22"/>
                 <w:szCs w:val="22"/>
               </w:rPr>
-              <w:t>……………………………………………</w:t>
+              <w:t>MSSV:</w:t>
+            </w:r>
+          </w:p>
+        </w:tc>
+        <w:tc>
+          <w:tcPr>
+            <w:tcMar>
+              <w:top w:w="100" w:type="dxa"/>
+              <w:left w:w="120" w:type="dxa"/>
+              <w:bottom w:w="100" w:type="dxa"/>
+              <w:right w:w="120" w:type="dxa"/>
+            </w:tcMar>
+          </w:tcPr>
+          <w:p>
+            <w:pPr>
+              <w:spacing w:line="360" w:lineRule="auto"/>
+            </w:pPr>
+            <w:r>
+              <w:rPr>
+                <w:rFonts w:ascii="Times New Roman" w:cs="Times New Roman"/>
+                <w:sz w:val="22"/>
+                <w:szCs w:val="22"/>
+              </w:rPr>
+              <w:t>24740451</w:t>
             </w:r>
           </w:p>
         </w:tc>
       </w:tr>
       <w:tr>
-        <w:tblPrEx>
-          <w:tblCellMar>
-            <w:top w:w="0" w:type="dxa"/>
-            <w:bottom w:w="0" w:type="dxa"/>
-          </w:tblCellMar>
-        </w:tblPrEx>
         <w:tc>
           <w:tcPr>
             <w:tcW w:w="3000" w:type="dxa"/>
             <w:tcBorders>
-              <w:top w:val="none" w:sz="0" w:space="0" w:color="FFFFFF"/>
-              <w:left w:val="none" w:sz="0" w:space="0" w:color="FFFFFF"/>
-              <w:bottom w:val="none" w:sz="0" w:space="0" w:color="FFFFFF"/>
-              <w:right w:val="none" w:sz="0" w:space="0" w:color="FFFFFF"/>
+              <w:top w:val="none"/>
+              <w:left w:val="none"/>
+              <w:bottom w:val="none"/>
+              <w:right w:val="none"/>
             </w:tcBorders>
             <w:tcMar>
               <w:top w:w="100" w:type="dxa"/>
@@ -185,11 +221,12 @@
             </w:pPr>
             <w:r>
               <w:rPr>
+                <w:rFonts w:ascii="Times New Roman" w:hAnsi="Times New Roman" w:eastAsia="Times New Roman" w:cs="Times New Roman"/>
                 <w:color w:val="000000" w:themeColor="text1"/>
                 <w:sz w:val="22"/>
                 <w:szCs w:val="22"/>
               </w:rPr>
-              <w:t>MSSV:</w:t>
+              <w:t>Lớp:</w:t>
             </w:r>
           </w:p>
         </w:tc>
@@ -197,10 +234,10 @@
           <w:tcPr>
             <w:tcW w:w="6350" w:type="dxa"/>
             <w:tcBorders>
-              <w:top w:val="none" w:sz="0" w:space="0" w:color="FFFFFF"/>
-              <w:left w:val="none" w:sz="0" w:space="0" w:color="FFFFFF"/>
-              <w:bottom w:val="none" w:sz="0" w:space="0" w:color="FFFFFF"/>
-              <w:right w:val="none" w:sz="0" w:space="0" w:color="FFFFFF"/>
+              <w:top w:val="none"/>
+              <w:left w:val="none"/>
+              <w:bottom w:val="none"/>
+              <w:right w:val="none"/>
             </w:tcBorders>
             <w:tcMar>
               <w:top w:w="100" w:type="dxa"/>
@@ -218,30 +255,24 @@
             </w:pPr>
             <w:r>
               <w:rPr>
-                <w:color w:val="000000" w:themeColor="text1"/>
+                <w:rFonts w:ascii="Times New Roman" w:cs="Times New Roman"/>
                 <w:sz w:val="22"/>
                 <w:szCs w:val="22"/>
               </w:rPr>
-              <w:t>……………………………………………</w:t>
+              <w:t>DHHTTT20B</w:t>
             </w:r>
           </w:p>
         </w:tc>
       </w:tr>
       <w:tr>
-        <w:tblPrEx>
-          <w:tblCellMar>
-            <w:top w:w="0" w:type="dxa"/>
-            <w:bottom w:w="0" w:type="dxa"/>
-          </w:tblCellMar>
-        </w:tblPrEx>
         <w:tc>
           <w:tcPr>
             <w:tcW w:w="3000" w:type="dxa"/>
             <w:tcBorders>
-              <w:top w:val="none" w:sz="0" w:space="0" w:color="FFFFFF"/>
-              <w:left w:val="none" w:sz="0" w:space="0" w:color="FFFFFF"/>
-              <w:bottom w:val="none" w:sz="0" w:space="0" w:color="FFFFFF"/>
-              <w:right w:val="none" w:sz="0" w:space="0" w:color="FFFFFF"/>
+              <w:top w:val="none"/>
+              <w:left w:val="none"/>
+              <w:bottom w:val="none"/>
+              <w:right w:val="none"/>
             </w:tcBorders>
             <w:tcMar>
               <w:top w:w="100" w:type="dxa"/>
@@ -259,11 +290,12 @@
             </w:pPr>
             <w:r>
               <w:rPr>
+                <w:rFonts w:ascii="Times New Roman" w:hAnsi="Times New Roman" w:eastAsia="Times New Roman" w:cs="Times New Roman"/>
                 <w:color w:val="000000" w:themeColor="text1"/>
                 <w:sz w:val="22"/>
                 <w:szCs w:val="22"/>
               </w:rPr>
-              <w:t>Lớp:</w:t>
+              <w:t>Tên repo GitHub (MSSV_HoTen_Cystone):</w:t>
             </w:r>
           </w:p>
         </w:tc>
@@ -271,10 +303,10 @@
           <w:tcPr>
             <w:tcW w:w="6350" w:type="dxa"/>
             <w:tcBorders>
-              <w:top w:val="none" w:sz="0" w:space="0" w:color="FFFFFF"/>
-              <w:left w:val="none" w:sz="0" w:space="0" w:color="FFFFFF"/>
-              <w:bottom w:val="none" w:sz="0" w:space="0" w:color="FFFFFF"/>
-              <w:right w:val="none" w:sz="0" w:space="0" w:color="FFFFFF"/>
+              <w:top w:val="none"/>
+              <w:left w:val="none"/>
+              <w:bottom w:val="none"/>
+              <w:right w:val="none"/>
             </w:tcBorders>
             <w:tcMar>
               <w:top w:w="100" w:type="dxa"/>
@@ -292,85 +324,11 @@
             </w:pPr>
             <w:r>
               <w:rPr>
-                <w:color w:val="000000" w:themeColor="text1"/>
-                <w:sz w:val="22"/>
-                <w:szCs w:val="22"/>
+                <w:rFonts w:ascii="Times New Roman" w:cs="Times New Roman"/>
+                <w:sz w:val="20"/>
+                <w:szCs w:val="20"/>
               </w:rPr>
-              <w:t>……………………………………………</w:t>
-            </w:r>
-          </w:p>
-        </w:tc>
-      </w:tr>
-      <w:tr>
-        <w:tblPrEx>
-          <w:tblCellMar>
-            <w:top w:w="0" w:type="dxa"/>
-            <w:bottom w:w="0" w:type="dxa"/>
-          </w:tblCellMar>
-        </w:tblPrEx>
-        <w:tc>
-          <w:tcPr>
-            <w:tcW w:w="3000" w:type="dxa"/>
-            <w:tcBorders>
-              <w:top w:val="none" w:sz="0" w:space="0" w:color="FFFFFF"/>
-              <w:left w:val="none" w:sz="0" w:space="0" w:color="FFFFFF"/>
-              <w:bottom w:val="none" w:sz="0" w:space="0" w:color="FFFFFF"/>
-              <w:right w:val="none" w:sz="0" w:space="0" w:color="FFFFFF"/>
-            </w:tcBorders>
-            <w:tcMar>
-              <w:top w:w="100" w:type="dxa"/>
-              <w:left w:w="120" w:type="dxa"/>
-              <w:bottom w:w="100" w:type="dxa"/>
-              <w:right w:w="120" w:type="dxa"/>
-            </w:tcMar>
-          </w:tcPr>
-          <w:p>
-            <w:pPr>
-              <w:spacing w:line="360" w:lineRule="auto"/>
-              <w:rPr>
-                <w:color w:val="000000" w:themeColor="text1"/>
-              </w:rPr>
-            </w:pPr>
-            <w:r>
-              <w:rPr>
-                <w:color w:val="000000" w:themeColor="text1"/>
-                <w:sz w:val="22"/>
-                <w:szCs w:val="22"/>
-              </w:rPr>
-              <w:t>Tên repo GitHub (MSSV_HoTen_Cystone):</w:t>
-            </w:r>
-          </w:p>
-        </w:tc>
-        <w:tc>
-          <w:tcPr>
-            <w:tcW w:w="6350" w:type="dxa"/>
-            <w:tcBorders>
-              <w:top w:val="none" w:sz="0" w:space="0" w:color="FFFFFF"/>
-              <w:left w:val="none" w:sz="0" w:space="0" w:color="FFFFFF"/>
-              <w:bottom w:val="none" w:sz="0" w:space="0" w:color="FFFFFF"/>
-              <w:right w:val="none" w:sz="0" w:space="0" w:color="FFFFFF"/>
-            </w:tcBorders>
-            <w:tcMar>
-              <w:top w:w="100" w:type="dxa"/>
-              <w:left w:w="120" w:type="dxa"/>
-              <w:bottom w:w="100" w:type="dxa"/>
-              <w:right w:w="120" w:type="dxa"/>
-            </w:tcMar>
-          </w:tcPr>
-          <w:p>
-            <w:pPr>
-              <w:spacing w:line="360" w:lineRule="auto"/>
-              <w:rPr>
-                <w:color w:val="000000" w:themeColor="text1"/>
-              </w:rPr>
-            </w:pPr>
-            <w:r>
-              <w:rPr>
-                <w:color w:val="000000" w:themeColor="text1"/>
-                <w:sz w:val="22"/>
-                <w:szCs w:val="22"/>
-              </w:rPr>
-              <w:t>……………………………………………</w:t>
+              <w:t>NguyenVuongQuocTuan_24740451</w:t>
             </w:r>
           </w:p>
         </w:tc>
@@ -396,9 +354,12 @@
       </w:pPr>
       <w:r>
         <w:rPr>
+          <w:rFonts w:ascii="Times New Roman" w:hAnsi="Times New Roman" w:eastAsia="Times New Roman" w:cs="Times New Roman"/>
           <w:b/>
           <w:bCs/>
           <w:color w:val="000000" w:themeColor="text1"/>
+          <w:sz w:val="26"/>
+          <w:szCs w:val="26"/>
         </w:rPr>
         <w:t>2. Link GitHub</w:t>
       </w:r>
@@ -412,6 +373,7 @@
       </w:pPr>
       <w:r>
         <w:rPr>
+          <w:rFonts w:ascii="Times New Roman" w:hAnsi="Times New Roman" w:eastAsia="Times New Roman" w:cs="Times New Roman"/>
           <w:color w:val="000000" w:themeColor="text1"/>
           <w:sz w:val="22"/>
           <w:szCs w:val="22"/>
@@ -420,6 +382,7 @@
       </w:r>
       <w:r>
         <w:rPr>
+          <w:rFonts w:ascii="Times New Roman" w:hAnsi="Times New Roman" w:eastAsia="Times New Roman" w:cs="Times New Roman"/>
           <w:b/>
           <w:bCs/>
           <w:color w:val="000000" w:themeColor="text1"/>
@@ -430,6 +393,7 @@
       </w:r>
       <w:r>
         <w:rPr>
+          <w:rFonts w:ascii="Times New Roman" w:hAnsi="Times New Roman" w:eastAsia="Times New Roman" w:cs="Times New Roman"/>
           <w:color w:val="000000" w:themeColor="text1"/>
           <w:sz w:val="22"/>
           <w:szCs w:val="22"/>
@@ -447,40 +411,27 @@
           <w:b/>
           <w:bCs/>
           <w:color w:val="000000" w:themeColor="text1"/>
-          <w:lang w:val="vi-VN"/>
-        </w:rPr>
-      </w:pPr>
-      <w:hyperlink r:id="rId5" w:history="1">
+        </w:rPr>
+      </w:pPr>
+      <w:hyperlink r:id="rId10">
         <w:r>
           <w:rPr>
-            <w:rStyle w:val="Hyperlink"/>
-            <w:color w:val="000000" w:themeColor="text1"/>
-            <w:sz w:val="22"/>
-            <w:szCs w:val="22"/>
+            <w:rFonts w:ascii="Times New Roman" w:cs="Times New Roman"/>
+            <w:sz w:val="20"/>
+            <w:szCs w:val="20"/>
           </w:rPr>
-          <w:t>https://github.com/&lt;MSSV_HoTen_Cystone&gt;/&lt;ten-repo&gt;</w:t>
+          <w:t>https://github.com/quoctuan0503/NguyenVuongQuocTuan_24740451.git</w:t>
         </w:r>
       </w:hyperlink>
       <w:r>
         <w:rPr>
           <w:rStyle w:val="Hyperlink"/>
+          <w:rFonts w:ascii="Times New Roman" w:hAnsi="Times New Roman" w:eastAsia="Times New Roman" w:cs="Times New Roman"/>
+          <w:b/>
+          <w:bCs/>
           <w:color w:val="000000" w:themeColor="text1"/>
           <w:sz w:val="22"/>
           <w:szCs w:val="22"/>
-          <w:lang w:val="vi-VN"/>
-        </w:rPr>
-        <w:t xml:space="preserve"> </w:t>
-      </w:r>
-      <w:r>
-        <w:rPr>
-          <w:rStyle w:val="Hyperlink"/>
-          <w:b/>
-          <w:bCs/>
-          <w:color w:val="000000" w:themeColor="text1"/>
-          <w:sz w:val="22"/>
-          <w:szCs w:val="22"/>
-          <w:u w:val="none"/>
-          <w:lang w:val="vi-VN"/>
         </w:rPr>
         <w:t>(lưu ý chỉnh chế độ public)</w:t>
       </w:r>
@@ -494,6 +445,7 @@
       </w:pPr>
       <w:r>
         <w:rPr>
+          <w:rFonts w:ascii="Times New Roman" w:hAnsi="Times New Roman" w:eastAsia="Times New Roman" w:cs="Times New Roman"/>
           <w:i/>
           <w:iCs/>
           <w:color w:val="000000" w:themeColor="text1"/>
@@ -503,6 +455,24 @@
     </w:p>
     <w:p>
       <w:pPr>
+        <w:spacing w:after="300" w:line="360" w:lineRule="auto"/>
+      </w:pPr>
+      <w:hyperlink r:id="rId11">
+        <w:r>
+          <w:rPr>
+            <w:rFonts w:ascii="Times New Roman" w:cs="Times New Roman"/>
+            <w:i/>
+            <w:iCs/>
+            <w:sz w:val="20"/>
+            <w:szCs w:val="20"/>
+            <w:u w:val="single"/>
+          </w:rPr>
+          <w:t>https://github.com/quoctuan0503/NguyenVuongQuocTuan_24740451</w:t>
+        </w:r>
+      </w:hyperlink>
+    </w:p>
+    <w:p>
+      <w:pPr>
         <w:pStyle w:val="Heading2"/>
         <w:spacing w:line="360" w:lineRule="auto"/>
         <w:rPr>
@@ -511,7 +481,10 @@
       </w:pPr>
       <w:r>
         <w:rPr>
-          <w:color w:val="000000" w:themeColor="text1"/>
+          <w:rFonts w:ascii="Times New Roman" w:hAnsi="Times New Roman" w:eastAsia="Times New Roman" w:cs="Times New Roman"/>
+          <w:color w:val="000000" w:themeColor="text1"/>
+          <w:sz w:val="26"/>
+          <w:szCs w:val="26"/>
         </w:rPr>
         <w:t>3. Minh chứng</w:t>
       </w:r>
@@ -525,6 +498,7 @@
       </w:pPr>
       <w:r>
         <w:rPr>
+          <w:rFonts w:ascii="Times New Roman" w:hAnsi="Times New Roman" w:eastAsia="Times New Roman" w:cs="Times New Roman"/>
           <w:color w:val="000000" w:themeColor="text1"/>
           <w:sz w:val="22"/>
           <w:szCs w:val="22"/>
@@ -547,18 +521,107 @@
         </w:rPr>
       </w:pPr>
       <w:r>
-        <w:rPr>
+        <w:drawing>
+          <wp:inline distT="0" distB="0" distL="0" distR="0">
+            <wp:extent cx="5829300" cy="3105150"/>
+            <wp:effectExtent l="0" t="0" r="0" b="0"/>
+            <wp:docPr id="100000" name="Picture 100000" descr="image.png"/>
+            <wp:cNvGraphicFramePr>
+              <a:graphicFrameLocks xmlns:a="http://schemas.openxmlformats.org/drawingml/2006/main" noChangeAspect="1"/>
+            </wp:cNvGraphicFramePr>
+            <a:graphic xmlns:a="http://schemas.openxmlformats.org/drawingml/2006/main">
+              <a:graphicData uri="http://schemas.openxmlformats.org/drawingml/2006/picture">
+                <pic:pic xmlns:pic="http://schemas.openxmlformats.org/drawingml/2006/picture">
+                  <pic:nvPicPr>
+                    <pic:cNvPr id="100000" name="image100000" descr="image.png"/>
+                    <pic:cNvPicPr/>
+                  </pic:nvPicPr>
+                  <pic:blipFill>
+                    <a:blip r:embed="rId8"/>
+                    <a:stretch>
+                      <a:fillRect/>
+                    </a:stretch>
+                  </pic:blipFill>
+                  <pic:spPr>
+                    <a:xfrm>
+                      <a:off x="0" y="0"/>
+                      <a:ext cx="5829300" cy="3105150"/>
+                    </a:xfrm>
+                    <a:prstGeom prst="rect">
+                      <a:avLst/>
+                    </a:prstGeom>
+                  </pic:spPr>
+                </pic:pic>
+              </a:graphicData>
+            </a:graphic>
+          </wp:inline>
+        </w:drawing>
+      </w:r>
+    </w:p>
+    <w:p>
+      <w:pPr>
+        <w:pBdr>
+          <w:top w:val="single" w:sz="6" w:space="0" w:color="999999"/>
+          <w:left w:val="single" w:sz="6" w:space="0" w:color="999999"/>
+          <w:bottom w:val="single" w:sz="6" w:space="0" w:color="999999"/>
+          <w:right w:val="single" w:sz="6" w:space="0" w:color="999999"/>
+        </w:pBdr>
+        <w:spacing w:before="200" w:after="200" w:line="360" w:lineRule="auto"/>
+        <w:jc w:val="center"/>
+        <w:rPr>
+          <w:color w:val="000000" w:themeColor="text1"/>
+        </w:rPr>
+      </w:pPr>
+      <w:r>
+        <w:drawing>
+          <wp:inline distT="0" distB="0" distL="0" distR="0">
+            <wp:extent cx="5829300" cy="2390775"/>
+            <wp:effectExtent l="0" t="0" r="0" b="0"/>
+            <wp:docPr id="100001" name="Picture 100001" descr="image.png"/>
+            <wp:cNvGraphicFramePr>
+              <a:graphicFrameLocks xmlns:a="http://schemas.openxmlformats.org/drawingml/2006/main" noChangeAspect="1"/>
+            </wp:cNvGraphicFramePr>
+            <a:graphic xmlns:a="http://schemas.openxmlformats.org/drawingml/2006/main">
+              <a:graphicData uri="http://schemas.openxmlformats.org/drawingml/2006/picture">
+                <pic:pic xmlns:pic="http://schemas.openxmlformats.org/drawingml/2006/picture">
+                  <pic:nvPicPr>
+                    <pic:cNvPr id="100001" name="image100001" descr="image.png"/>
+                    <pic:cNvPicPr/>
+                  </pic:nvPicPr>
+                  <pic:blipFill>
+                    <a:blip r:embed="rId9"/>
+                    <a:stretch>
+                      <a:fillRect/>
+                    </a:stretch>
+                  </pic:blipFill>
+                  <pic:spPr>
+                    <a:xfrm>
+                      <a:off x="0" y="0"/>
+                      <a:ext cx="5829300" cy="2390775"/>
+                    </a:xfrm>
+                    <a:prstGeom prst="rect">
+                      <a:avLst/>
+                    </a:prstGeom>
+                  </pic:spPr>
+                </pic:pic>
+              </a:graphicData>
+            </a:graphic>
+          </wp:inline>
+        </w:drawing>
+      </w:r>
+      <w:r>
+        <w:rPr>
+          <w:rFonts w:ascii="Times New Roman" w:hAnsi="Times New Roman" w:eastAsia="Times New Roman" w:cs="Times New Roman"/>
           <w:i/>
           <w:iCs/>
           <w:color w:val="000000" w:themeColor="text1"/>
         </w:rPr>
-        <w:t xml:space="preserve">    [ Dán ảnh chụp full màn hình vào đây ]    </w:t>
+        <w:t xml:space="preserve">     </w:t>
       </w:r>
     </w:p>
     <w:sectPr>
       <w:pgSz w:w="12240" w:h="15840"/>
       <w:pgMar w:top="1440" w:right="1440" w:bottom="1440" w:left="1440" w:header="708" w:footer="708" w:gutter="0"/>
-      <w:cols w:space="720"/>
       <w:docGrid w:linePitch="360"/>
     </w:sectPr>
   </w:body>

</xml_diff>